<commit_message>
Semester 6 last week
</commit_message>
<xml_diff>
--- a/Semester-6/UI-UX/Lab Work/ass_11.docx
+++ b/Semester-6/UI-UX/Lab Work/ass_11.docx
@@ -217,12 +217,58 @@
     <w:p>
       <w:pPr>
         <w:spacing w:after="0"/>
-        <w:jc w:val="both"/>
-      </w:pPr>
+        <w:jc w:val="center"/>
+      </w:pPr>
+      <w:r>
+        <w:rPr>
+          <w:noProof/>
+        </w:rPr>
+        <w:drawing>
+          <wp:inline distT="0" distB="0" distL="0" distR="0" wp14:anchorId="36549B2E" wp14:editId="02877152">
+            <wp:extent cx="3826934" cy="6008068"/>
+            <wp:effectExtent l="0" t="0" r="2540" b="0"/>
+            <wp:docPr id="536685361" name="Picture 1"/>
+            <wp:cNvGraphicFramePr>
+              <a:graphicFrameLocks xmlns:a="http://schemas.openxmlformats.org/drawingml/2006/main" noChangeAspect="1"/>
+            </wp:cNvGraphicFramePr>
+            <a:graphic xmlns:a="http://schemas.openxmlformats.org/drawingml/2006/main">
+              <a:graphicData uri="http://schemas.openxmlformats.org/drawingml/2006/picture">
+                <pic:pic xmlns:pic="http://schemas.openxmlformats.org/drawingml/2006/picture">
+                  <pic:nvPicPr>
+                    <pic:cNvPr id="536685361" name="Picture 536685361"/>
+                    <pic:cNvPicPr/>
+                  </pic:nvPicPr>
+                  <pic:blipFill>
+                    <a:blip r:embed="rId7" cstate="print">
+                      <a:extLst>
+                        <a:ext uri="{28A0092B-C50C-407E-A947-70E740481C1C}">
+                          <a14:useLocalDpi xmlns:a14="http://schemas.microsoft.com/office/drawing/2010/main" val="0"/>
+                        </a:ext>
+                      </a:extLst>
+                    </a:blip>
+                    <a:stretch>
+                      <a:fillRect/>
+                    </a:stretch>
+                  </pic:blipFill>
+                  <pic:spPr>
+                    <a:xfrm>
+                      <a:off x="0" y="0"/>
+                      <a:ext cx="3833506" cy="6018385"/>
+                    </a:xfrm>
+                    <a:prstGeom prst="rect">
+                      <a:avLst/>
+                    </a:prstGeom>
+                  </pic:spPr>
+                </pic:pic>
+              </a:graphicData>
+            </a:graphic>
+          </wp:inline>
+        </w:drawing>
+      </w:r>
     </w:p>
     <w:sectPr>
-      <w:headerReference w:type="default" r:id="rId7"/>
-      <w:footerReference w:type="default" r:id="rId8"/>
+      <w:headerReference w:type="default" r:id="rId8"/>
+      <w:footerReference w:type="default" r:id="rId9"/>
       <w:pgSz w:w="11906" w:h="16838"/>
       <w:pgMar w:top="720" w:right="720" w:bottom="720" w:left="720" w:header="708" w:footer="708" w:gutter="0"/>
       <w:cols w:space="708"/>
@@ -366,13 +412,31 @@
               <w:szCs w:val="28"/>
             </w:rPr>
           </w:pPr>
+          <w:proofErr w:type="spellStart"/>
           <w:r>
             <w:rPr>
               <w:rFonts w:ascii="Cambria" w:hAnsi="Cambria"/>
               <w:sz w:val="28"/>
               <w:szCs w:val="28"/>
             </w:rPr>
-            <w:t>Enrollment No: 22010XXXXXX</w:t>
+            <w:t>Enrollment</w:t>
+          </w:r>
+          <w:proofErr w:type="spellEnd"/>
+          <w:r>
+            <w:rPr>
+              <w:rFonts w:ascii="Cambria" w:hAnsi="Cambria"/>
+              <w:sz w:val="28"/>
+              <w:szCs w:val="28"/>
+            </w:rPr>
+            <w:t xml:space="preserve"> No: 2</w:t>
+          </w:r>
+          <w:r>
+            <w:rPr>
+              <w:rFonts w:ascii="Cambria" w:hAnsi="Cambria"/>
+              <w:sz w:val="28"/>
+              <w:szCs w:val="28"/>
+            </w:rPr>
+            <w:t>4010101621</w:t>
           </w:r>
         </w:p>
       </w:tc>
@@ -680,7 +744,6 @@
       </w:rPr>
       <w:t xml:space="preserve">  </w:t>
     </w:r>
-    <w:proofErr w:type="gramStart"/>
     <w:r>
       <w:rPr>
         <w:rFonts w:ascii="Cambria" w:hAnsi="Cambria"/>
@@ -689,7 +752,7 @@
         <w:sz w:val="24"/>
         <w:szCs w:val="24"/>
       </w:rPr>
-      <w:t>/</w:t>
+      <w:t>14</w:t>
     </w:r>
     <w:r>
       <w:rPr>
@@ -699,7 +762,7 @@
         <w:sz w:val="24"/>
         <w:szCs w:val="24"/>
       </w:rPr>
-      <w:t xml:space="preserve">  </w:t>
+      <w:t>/</w:t>
     </w:r>
     <w:r>
       <w:rPr>
@@ -709,9 +772,8 @@
         <w:sz w:val="24"/>
         <w:szCs w:val="24"/>
       </w:rPr>
-      <w:t>/</w:t>
+      <w:t>02</w:t>
     </w:r>
-    <w:proofErr w:type="gramEnd"/>
     <w:r>
       <w:rPr>
         <w:rFonts w:ascii="Cambria" w:hAnsi="Cambria"/>
@@ -720,7 +782,7 @@
         <w:sz w:val="24"/>
         <w:szCs w:val="24"/>
       </w:rPr>
-      <w:t xml:space="preserve"> </w:t>
+      <w:t>/</w:t>
     </w:r>
     <w:r>
       <w:rPr>
@@ -740,7 +802,7 @@
         <w:sz w:val="24"/>
         <w:szCs w:val="24"/>
       </w:rPr>
-      <w:t>5</w:t>
+      <w:t>6</w:t>
     </w:r>
     <w:r>
       <w:rPr>

</xml_diff>